<commit_message>
Add map based visualization and updated knitting files
</commit_message>
<xml_diff>
--- a/2026.07.19 Khem Second Draft.docx
+++ b/2026.07.19 Khem Second Draft.docx
@@ -1334,6 +1334,8 @@
         <w:pStyle w:val="BodyText"/>
         <w:rPr>
           <w:rFonts w:ascii="Times New Roman" w:hAnsi="Times New Roman" w:cs="Times New Roman"/>
+          <w:b/>
+          <w:bCs/>
         </w:rPr>
       </w:pPr>
       <m:oMathPara>
@@ -1347,6 +1349,8 @@
             </m:rPr>
             <w:rPr>
               <w:rFonts w:ascii="Times New Roman" w:hAnsi="Times New Roman" w:cs="Times New Roman"/>
+              <w:b/>
+              <w:bCs/>
             </w:rPr>
             <m:t>logit</m:t>
           </m:r>
@@ -1355,11 +1359,16 @@
               <m:ctrlPr>
                 <w:rPr>
                   <w:rFonts w:ascii="Cambria Math" w:hAnsi="Cambria Math" w:cs="Times New Roman"/>
+                  <w:b/>
+                  <w:bCs/>
                 </w:rPr>
               </m:ctrlPr>
             </m:dPr>
             <m:e>
               <m:r>
+                <m:rPr>
+                  <m:sty m:val="bi"/>
+                </m:rPr>
                 <w:rPr>
                   <w:rFonts w:ascii="Cambria Math" w:hAnsi="Cambria Math" w:cs="Times New Roman"/>
                 </w:rPr>
@@ -1370,6 +1379,8 @@
                   <m:ctrlPr>
                     <w:rPr>
                       <w:rFonts w:ascii="Cambria Math" w:hAnsi="Cambria Math" w:cs="Times New Roman"/>
+                      <w:b/>
+                      <w:bCs/>
                     </w:rPr>
                   </m:ctrlPr>
                 </m:dPr>
@@ -1380,12 +1391,14 @@
                     </m:rPr>
                     <w:rPr>
                       <w:rFonts w:ascii="Times New Roman" w:hAnsi="Times New Roman" w:cs="Times New Roman"/>
+                      <w:b/>
+                      <w:bCs/>
                     </w:rPr>
                     <m:t>ZD</m:t>
                   </m:r>
                   <m:r>
                     <m:rPr>
-                      <m:sty m:val="p"/>
+                      <m:sty m:val="b"/>
                     </m:rPr>
                     <w:rPr>
                       <w:rFonts w:ascii="Cambria Math" w:hAnsi="Cambria Math" w:cs="Times New Roman"/>
@@ -1393,6 +1406,9 @@
                     <m:t>=</m:t>
                   </m:r>
                   <m:r>
+                    <m:rPr>
+                      <m:sty m:val="bi"/>
+                    </m:rPr>
                     <w:rPr>
                       <w:rFonts w:ascii="Cambria Math" w:hAnsi="Cambria Math" w:cs="Times New Roman"/>
                     </w:rPr>
@@ -1404,7 +1420,7 @@
           </m:d>
           <m:r>
             <m:rPr>
-              <m:sty m:val="p"/>
+              <m:sty m:val="b"/>
             </m:rPr>
             <w:rPr>
               <w:rFonts w:ascii="Cambria Math" w:hAnsi="Cambria Math" w:cs="Times New Roman"/>
@@ -1416,11 +1432,16 @@
               <m:ctrlPr>
                 <w:rPr>
                   <w:rFonts w:ascii="Cambria Math" w:hAnsi="Cambria Math" w:cs="Times New Roman"/>
+                  <w:b/>
+                  <w:bCs/>
                 </w:rPr>
               </m:ctrlPr>
             </m:sSubPr>
             <m:e>
               <m:r>
+                <m:rPr>
+                  <m:sty m:val="bi"/>
+                </m:rPr>
                 <w:rPr>
                   <w:rFonts w:ascii="Cambria Math" w:hAnsi="Cambria Math" w:cs="Times New Roman"/>
                 </w:rPr>
@@ -1429,6 +1450,9 @@
             </m:e>
             <m:sub>
               <m:r>
+                <m:rPr>
+                  <m:sty m:val="bi"/>
+                </m:rPr>
                 <w:rPr>
                   <w:rFonts w:ascii="Cambria Math" w:hAnsi="Cambria Math" w:cs="Times New Roman"/>
                 </w:rPr>
@@ -1438,7 +1462,7 @@
           </m:sSub>
           <m:r>
             <m:rPr>
-              <m:sty m:val="p"/>
+              <m:sty m:val="b"/>
             </m:rPr>
             <w:rPr>
               <w:rFonts w:ascii="Cambria Math" w:hAnsi="Cambria Math" w:cs="Times New Roman"/>
@@ -1450,11 +1474,16 @@
               <m:ctrlPr>
                 <w:rPr>
                   <w:rFonts w:ascii="Cambria Math" w:hAnsi="Cambria Math" w:cs="Times New Roman"/>
+                  <w:b/>
+                  <w:bCs/>
                 </w:rPr>
               </m:ctrlPr>
             </m:sSubPr>
             <m:e>
               <m:r>
+                <m:rPr>
+                  <m:sty m:val="bi"/>
+                </m:rPr>
                 <w:rPr>
                   <w:rFonts w:ascii="Cambria Math" w:hAnsi="Cambria Math" w:cs="Times New Roman"/>
                 </w:rPr>
@@ -1463,6 +1492,9 @@
             </m:e>
             <m:sub>
               <m:r>
+                <m:rPr>
+                  <m:sty m:val="bi"/>
+                </m:rPr>
                 <w:rPr>
                   <w:rFonts w:ascii="Cambria Math" w:hAnsi="Cambria Math" w:cs="Times New Roman"/>
                 </w:rPr>
@@ -1472,7 +1504,7 @@
           </m:sSub>
           <m:r>
             <m:rPr>
-              <m:sty m:val="p"/>
+              <m:sty m:val="b"/>
             </m:rPr>
             <w:rPr>
               <w:rFonts w:ascii="Cambria Math" w:hAnsi="Cambria Math" w:cs="Times New Roman"/>
@@ -1485,12 +1517,14 @@
             </m:rPr>
             <w:rPr>
               <w:rFonts w:ascii="Times New Roman" w:hAnsi="Times New Roman" w:cs="Times New Roman"/>
+              <w:b/>
+              <w:bCs/>
             </w:rPr>
             <m:t>Distance</m:t>
           </m:r>
           <m:r>
             <m:rPr>
-              <m:sty m:val="p"/>
+              <m:sty m:val="b"/>
             </m:rPr>
             <w:rPr>
               <w:rFonts w:ascii="Cambria Math" w:hAnsi="Cambria Math" w:cs="Times New Roman"/>
@@ -1502,11 +1536,16 @@
               <m:ctrlPr>
                 <w:rPr>
                   <w:rFonts w:ascii="Cambria Math" w:hAnsi="Cambria Math" w:cs="Times New Roman"/>
+                  <w:b/>
+                  <w:bCs/>
                 </w:rPr>
               </m:ctrlPr>
             </m:sSubPr>
             <m:e>
               <m:r>
+                <m:rPr>
+                  <m:sty m:val="bi"/>
+                </m:rPr>
                 <w:rPr>
                   <w:rFonts w:ascii="Cambria Math" w:hAnsi="Cambria Math" w:cs="Times New Roman"/>
                 </w:rPr>
@@ -1515,6 +1554,9 @@
             </m:e>
             <m:sub>
               <m:r>
+                <m:rPr>
+                  <m:sty m:val="bi"/>
+                </m:rPr>
                 <w:rPr>
                   <w:rFonts w:ascii="Cambria Math" w:hAnsi="Cambria Math" w:cs="Times New Roman"/>
                 </w:rPr>
@@ -1524,7 +1566,7 @@
           </m:sSub>
           <m:r>
             <m:rPr>
-              <m:sty m:val="p"/>
+              <m:sty m:val="b"/>
             </m:rPr>
             <w:rPr>
               <w:rFonts w:ascii="Cambria Math" w:hAnsi="Cambria Math" w:cs="Times New Roman"/>
@@ -1537,12 +1579,14 @@
             </m:rPr>
             <w:rPr>
               <w:rFonts w:ascii="Times New Roman" w:hAnsi="Times New Roman" w:cs="Times New Roman"/>
+              <w:b/>
+              <w:bCs/>
             </w:rPr>
             <m:t>Age</m:t>
           </m:r>
           <m:r>
             <m:rPr>
-              <m:sty m:val="p"/>
+              <m:sty m:val="b"/>
             </m:rPr>
             <w:rPr>
               <w:rFonts w:ascii="Cambria Math" w:hAnsi="Cambria Math" w:cs="Times New Roman"/>
@@ -1554,11 +1598,16 @@
               <m:ctrlPr>
                 <w:rPr>
                   <w:rFonts w:ascii="Cambria Math" w:hAnsi="Cambria Math" w:cs="Times New Roman"/>
+                  <w:b/>
+                  <w:bCs/>
                 </w:rPr>
               </m:ctrlPr>
             </m:sSubPr>
             <m:e>
               <m:r>
+                <m:rPr>
+                  <m:sty m:val="bi"/>
+                </m:rPr>
                 <w:rPr>
                   <w:rFonts w:ascii="Cambria Math" w:hAnsi="Cambria Math" w:cs="Times New Roman"/>
                 </w:rPr>
@@ -1567,6 +1616,9 @@
             </m:e>
             <m:sub>
               <m:r>
+                <m:rPr>
+                  <m:sty m:val="bi"/>
+                </m:rPr>
                 <w:rPr>
                   <w:rFonts w:ascii="Cambria Math" w:hAnsi="Cambria Math" w:cs="Times New Roman"/>
                 </w:rPr>
@@ -1576,7 +1628,7 @@
           </m:sSub>
           <m:r>
             <m:rPr>
-              <m:sty m:val="p"/>
+              <m:sty m:val="b"/>
             </m:rPr>
             <w:rPr>
               <w:rFonts w:ascii="Cambria Math" w:hAnsi="Cambria Math" w:cs="Times New Roman"/>
@@ -1589,12 +1641,14 @@
             </m:rPr>
             <w:rPr>
               <w:rFonts w:ascii="Times New Roman" w:hAnsi="Times New Roman" w:cs="Times New Roman"/>
+              <w:b/>
+              <w:bCs/>
             </w:rPr>
             <m:t>Gender</m:t>
           </m:r>
           <m:r>
             <m:rPr>
-              <m:sty m:val="p"/>
+              <m:sty m:val="b"/>
             </m:rPr>
             <w:rPr>
               <w:rFonts w:ascii="Cambria Math" w:hAnsi="Cambria Math" w:cs="Times New Roman"/>
@@ -1602,6 +1656,9 @@
             <m:t>+</m:t>
           </m:r>
           <m:r>
+            <m:rPr>
+              <m:sty m:val="bi"/>
+            </m:rPr>
             <w:rPr>
               <w:rFonts w:ascii="Cambria Math" w:hAnsi="Cambria Math" w:cs="Times New Roman"/>
             </w:rPr>
@@ -1612,6 +1669,8 @@
               <m:ctrlPr>
                 <w:rPr>
                   <w:rFonts w:ascii="Cambria Math" w:hAnsi="Cambria Math" w:cs="Times New Roman"/>
+                  <w:b/>
+                  <w:bCs/>
                 </w:rPr>
               </m:ctrlPr>
             </m:dPr>
@@ -1622,6 +1681,8 @@
                 </m:rPr>
                 <w:rPr>
                   <w:rFonts w:ascii="Times New Roman" w:hAnsi="Times New Roman" w:cs="Times New Roman"/>
+                  <w:b/>
+                  <w:bCs/>
                 </w:rPr>
                 <m:t>ward</m:t>
               </m:r>
@@ -1662,7 +1723,9 @@
       <w:pPr>
         <w:pStyle w:val="BodyText"/>
         <w:rPr>
-          <w:rFonts w:ascii="Times New Roman" w:hAnsi="Times New Roman" w:cs="Times New Roman"/>
+          <w:rFonts w:ascii="Times New Roman" w:eastAsiaTheme="minorEastAsia" w:hAnsi="Times New Roman" w:cs="Times New Roman"/>
+          <w:b/>
+          <w:bCs/>
         </w:rPr>
       </w:pPr>
       <m:oMathPara>
@@ -1676,6 +1739,8 @@
             </m:rPr>
             <w:rPr>
               <w:rFonts w:ascii="Times New Roman" w:hAnsi="Times New Roman" w:cs="Times New Roman"/>
+              <w:b/>
+              <w:bCs/>
             </w:rPr>
             <m:t>logit</m:t>
           </m:r>
@@ -1684,11 +1749,16 @@
               <m:ctrlPr>
                 <w:rPr>
                   <w:rFonts w:ascii="Cambria Math" w:hAnsi="Cambria Math" w:cs="Times New Roman"/>
+                  <w:b/>
+                  <w:bCs/>
                 </w:rPr>
               </m:ctrlPr>
             </m:dPr>
             <m:e>
               <m:r>
+                <m:rPr>
+                  <m:sty m:val="bi"/>
+                </m:rPr>
                 <w:rPr>
                   <w:rFonts w:ascii="Cambria Math" w:hAnsi="Cambria Math" w:cs="Times New Roman"/>
                 </w:rPr>
@@ -1699,6 +1769,8 @@
                   <m:ctrlPr>
                     <w:rPr>
                       <w:rFonts w:ascii="Cambria Math" w:hAnsi="Cambria Math" w:cs="Times New Roman"/>
+                      <w:b/>
+                      <w:bCs/>
                     </w:rPr>
                   </m:ctrlPr>
                 </m:dPr>
@@ -1709,12 +1781,14 @@
                     </m:rPr>
                     <w:rPr>
                       <w:rFonts w:ascii="Times New Roman" w:hAnsi="Times New Roman" w:cs="Times New Roman"/>
+                      <w:b/>
+                      <w:bCs/>
                     </w:rPr>
                     <m:t>Recovered</m:t>
                   </m:r>
                   <m:r>
                     <m:rPr>
-                      <m:sty m:val="p"/>
+                      <m:sty m:val="b"/>
                     </m:rPr>
                     <w:rPr>
                       <w:rFonts w:ascii="Cambria Math" w:hAnsi="Cambria Math" w:cs="Times New Roman"/>
@@ -1722,6 +1796,9 @@
                     <m:t>=</m:t>
                   </m:r>
                   <m:r>
+                    <m:rPr>
+                      <m:sty m:val="bi"/>
+                    </m:rPr>
                     <w:rPr>
                       <w:rFonts w:ascii="Cambria Math" w:hAnsi="Cambria Math" w:cs="Times New Roman"/>
                     </w:rPr>
@@ -1733,7 +1810,7 @@
           </m:d>
           <m:r>
             <m:rPr>
-              <m:sty m:val="p"/>
+              <m:sty m:val="b"/>
             </m:rPr>
             <w:rPr>
               <w:rFonts w:ascii="Cambria Math" w:hAnsi="Cambria Math" w:cs="Times New Roman"/>
@@ -1745,11 +1822,16 @@
               <m:ctrlPr>
                 <w:rPr>
                   <w:rFonts w:ascii="Cambria Math" w:hAnsi="Cambria Math" w:cs="Times New Roman"/>
+                  <w:b/>
+                  <w:bCs/>
                 </w:rPr>
               </m:ctrlPr>
             </m:sSubPr>
             <m:e>
               <m:r>
+                <m:rPr>
+                  <m:sty m:val="bi"/>
+                </m:rPr>
                 <w:rPr>
                   <w:rFonts w:ascii="Cambria Math" w:hAnsi="Cambria Math" w:cs="Times New Roman"/>
                 </w:rPr>
@@ -1758,6 +1840,9 @@
             </m:e>
             <m:sub>
               <m:r>
+                <m:rPr>
+                  <m:sty m:val="bi"/>
+                </m:rPr>
                 <w:rPr>
                   <w:rFonts w:ascii="Cambria Math" w:hAnsi="Cambria Math" w:cs="Times New Roman"/>
                 </w:rPr>
@@ -1767,7 +1852,7 @@
           </m:sSub>
           <m:r>
             <m:rPr>
-              <m:sty m:val="p"/>
+              <m:sty m:val="b"/>
             </m:rPr>
             <w:rPr>
               <w:rFonts w:ascii="Cambria Math" w:hAnsi="Cambria Math" w:cs="Times New Roman"/>
@@ -1779,11 +1864,16 @@
               <m:ctrlPr>
                 <w:rPr>
                   <w:rFonts w:ascii="Cambria Math" w:hAnsi="Cambria Math" w:cs="Times New Roman"/>
+                  <w:b/>
+                  <w:bCs/>
                 </w:rPr>
               </m:ctrlPr>
             </m:sSubPr>
             <m:e>
               <m:r>
+                <m:rPr>
+                  <m:sty m:val="bi"/>
+                </m:rPr>
                 <w:rPr>
                   <w:rFonts w:ascii="Cambria Math" w:hAnsi="Cambria Math" w:cs="Times New Roman"/>
                 </w:rPr>
@@ -1792,6 +1882,9 @@
             </m:e>
             <m:sub>
               <m:r>
+                <m:rPr>
+                  <m:sty m:val="bi"/>
+                </m:rPr>
                 <w:rPr>
                   <w:rFonts w:ascii="Cambria Math" w:hAnsi="Cambria Math" w:cs="Times New Roman"/>
                 </w:rPr>
@@ -1801,7 +1894,7 @@
           </m:sSub>
           <m:r>
             <m:rPr>
-              <m:sty m:val="p"/>
+              <m:sty m:val="b"/>
             </m:rPr>
             <w:rPr>
               <w:rFonts w:ascii="Cambria Math" w:hAnsi="Cambria Math" w:cs="Times New Roman"/>
@@ -1814,12 +1907,14 @@
             </m:rPr>
             <w:rPr>
               <w:rFonts w:ascii="Times New Roman" w:hAnsi="Times New Roman" w:cs="Times New Roman"/>
+              <w:b/>
+              <w:bCs/>
             </w:rPr>
             <m:t>Method</m:t>
           </m:r>
           <m:r>
             <m:rPr>
-              <m:sty m:val="p"/>
+              <m:sty m:val="b"/>
             </m:rPr>
             <w:rPr>
               <w:rFonts w:ascii="Cambria Math" w:hAnsi="Cambria Math" w:cs="Times New Roman"/>
@@ -1831,11 +1926,16 @@
               <m:ctrlPr>
                 <w:rPr>
                   <w:rFonts w:ascii="Cambria Math" w:hAnsi="Cambria Math" w:cs="Times New Roman"/>
+                  <w:b/>
+                  <w:bCs/>
                 </w:rPr>
               </m:ctrlPr>
             </m:sSubPr>
             <m:e>
               <m:r>
+                <m:rPr>
+                  <m:sty m:val="bi"/>
+                </m:rPr>
                 <w:rPr>
                   <w:rFonts w:ascii="Cambria Math" w:hAnsi="Cambria Math" w:cs="Times New Roman"/>
                 </w:rPr>
@@ -1844,6 +1944,9 @@
             </m:e>
             <m:sub>
               <m:r>
+                <m:rPr>
+                  <m:sty m:val="bi"/>
+                </m:rPr>
                 <w:rPr>
                   <w:rFonts w:ascii="Cambria Math" w:hAnsi="Cambria Math" w:cs="Times New Roman"/>
                 </w:rPr>
@@ -1853,7 +1956,7 @@
           </m:sSub>
           <m:r>
             <m:rPr>
-              <m:sty m:val="p"/>
+              <m:sty m:val="b"/>
             </m:rPr>
             <w:rPr>
               <w:rFonts w:ascii="Cambria Math" w:hAnsi="Cambria Math" w:cs="Times New Roman"/>
@@ -1866,28 +1969,52 @@
             </m:rPr>
             <w:rPr>
               <w:rFonts w:ascii="Times New Roman" w:hAnsi="Times New Roman" w:cs="Times New Roman"/>
+              <w:b/>
+              <w:bCs/>
             </w:rPr>
             <m:t>Distance</m:t>
           </m:r>
           <m:r>
             <m:rPr>
-              <m:sty m:val="p"/>
+              <m:sty m:val="b"/>
             </m:rPr>
             <w:rPr>
               <w:rFonts w:ascii="Cambria Math" w:hAnsi="Cambria Math" w:cs="Times New Roman"/>
             </w:rPr>
             <m:t>+</m:t>
           </m:r>
+        </m:oMath>
+      </m:oMathPara>
+    </w:p>
+    <w:p>
+      <w:pPr>
+        <w:pStyle w:val="BodyText"/>
+        <w:rPr>
+          <w:rFonts w:ascii="Times New Roman" w:hAnsi="Times New Roman" w:cs="Times New Roman"/>
+          <w:b/>
+          <w:bCs/>
+        </w:rPr>
+      </w:pPr>
+      <m:oMathPara>
+        <m:oMathParaPr>
+          <m:jc m:val="center"/>
+        </m:oMathParaPr>
+        <m:oMath>
           <m:sSub>
             <m:sSubPr>
               <m:ctrlPr>
                 <w:rPr>
                   <w:rFonts w:ascii="Cambria Math" w:hAnsi="Cambria Math" w:cs="Times New Roman"/>
+                  <w:b/>
+                  <w:bCs/>
                 </w:rPr>
               </m:ctrlPr>
             </m:sSubPr>
             <m:e>
               <m:r>
+                <m:rPr>
+                  <m:sty m:val="bi"/>
+                </m:rPr>
                 <w:rPr>
                   <w:rFonts w:ascii="Cambria Math" w:hAnsi="Cambria Math" w:cs="Times New Roman"/>
                 </w:rPr>
@@ -1896,6 +2023,9 @@
             </m:e>
             <m:sub>
               <m:r>
+                <m:rPr>
+                  <m:sty m:val="bi"/>
+                </m:rPr>
                 <w:rPr>
                   <w:rFonts w:ascii="Cambria Math" w:hAnsi="Cambria Math" w:cs="Times New Roman"/>
                 </w:rPr>
@@ -1905,7 +2035,7 @@
           </m:sSub>
           <m:r>
             <m:rPr>
-              <m:sty m:val="p"/>
+              <m:sty m:val="b"/>
             </m:rPr>
             <w:rPr>
               <w:rFonts w:ascii="Cambria Math" w:hAnsi="Cambria Math" w:cs="Times New Roman"/>
@@ -1918,12 +2048,14 @@
             </m:rPr>
             <w:rPr>
               <w:rFonts w:ascii="Times New Roman" w:hAnsi="Times New Roman" w:cs="Times New Roman"/>
+              <w:b/>
+              <w:bCs/>
             </w:rPr>
             <m:t>Age</m:t>
           </m:r>
           <m:r>
             <m:rPr>
-              <m:sty m:val="p"/>
+              <m:sty m:val="b"/>
             </m:rPr>
             <w:rPr>
               <w:rFonts w:ascii="Cambria Math" w:hAnsi="Cambria Math" w:cs="Times New Roman"/>
@@ -1935,11 +2067,16 @@
               <m:ctrlPr>
                 <w:rPr>
                   <w:rFonts w:ascii="Cambria Math" w:hAnsi="Cambria Math" w:cs="Times New Roman"/>
+                  <w:b/>
+                  <w:bCs/>
                 </w:rPr>
               </m:ctrlPr>
             </m:sSubPr>
             <m:e>
               <m:r>
+                <m:rPr>
+                  <m:sty m:val="bi"/>
+                </m:rPr>
                 <w:rPr>
                   <w:rFonts w:ascii="Cambria Math" w:hAnsi="Cambria Math" w:cs="Times New Roman"/>
                 </w:rPr>
@@ -1948,6 +2085,9 @@
             </m:e>
             <m:sub>
               <m:r>
+                <m:rPr>
+                  <m:sty m:val="bi"/>
+                </m:rPr>
                 <w:rPr>
                   <w:rFonts w:ascii="Cambria Math" w:hAnsi="Cambria Math" w:cs="Times New Roman"/>
                 </w:rPr>
@@ -1957,7 +2097,7 @@
           </m:sSub>
           <m:r>
             <m:rPr>
-              <m:sty m:val="p"/>
+              <m:sty m:val="b"/>
             </m:rPr>
             <w:rPr>
               <w:rFonts w:ascii="Cambria Math" w:hAnsi="Cambria Math" w:cs="Times New Roman"/>
@@ -1970,12 +2110,14 @@
             </m:rPr>
             <w:rPr>
               <w:rFonts w:ascii="Times New Roman" w:hAnsi="Times New Roman" w:cs="Times New Roman"/>
+              <w:b/>
+              <w:bCs/>
             </w:rPr>
             <m:t>DaysSinceVisit</m:t>
           </m:r>
           <m:r>
             <m:rPr>
-              <m:sty m:val="p"/>
+              <m:sty m:val="b"/>
             </m:rPr>
             <w:rPr>
               <w:rFonts w:ascii="Cambria Math" w:hAnsi="Cambria Math" w:cs="Times New Roman"/>
@@ -1983,6 +2125,9 @@
             <m:t>+</m:t>
           </m:r>
           <m:r>
+            <m:rPr>
+              <m:sty m:val="bi"/>
+            </m:rPr>
             <w:rPr>
               <w:rFonts w:ascii="Cambria Math" w:hAnsi="Cambria Math" w:cs="Times New Roman"/>
             </w:rPr>
@@ -1993,6 +2138,8 @@
               <m:ctrlPr>
                 <w:rPr>
                   <w:rFonts w:ascii="Cambria Math" w:hAnsi="Cambria Math" w:cs="Times New Roman"/>
+                  <w:b/>
+                  <w:bCs/>
                 </w:rPr>
               </m:ctrlPr>
             </m:dPr>
@@ -2003,6 +2150,8 @@
                 </m:rPr>
                 <w:rPr>
                   <w:rFonts w:ascii="Times New Roman" w:hAnsi="Times New Roman" w:cs="Times New Roman"/>
+                  <w:b/>
+                  <w:bCs/>
                 </w:rPr>
                 <m:t>ward</m:t>
               </m:r>
@@ -2074,7 +2223,9 @@
       <w:pPr>
         <w:pStyle w:val="BodyText"/>
         <w:rPr>
-          <w:rFonts w:ascii="Times New Roman" w:hAnsi="Times New Roman" w:cs="Times New Roman"/>
+          <w:rFonts w:ascii="Times New Roman" w:eastAsiaTheme="minorEastAsia" w:hAnsi="Times New Roman" w:cs="Times New Roman"/>
+          <w:b/>
+          <w:bCs/>
         </w:rPr>
       </w:pPr>
       <m:oMathPara>
@@ -2084,7 +2235,7 @@
         <m:oMath>
           <m:r>
             <m:rPr>
-              <m:sty m:val="p"/>
+              <m:sty m:val="b"/>
             </m:rPr>
             <w:rPr>
               <w:rFonts w:ascii="Cambria Math" w:hAnsi="Cambria Math" w:cs="Times New Roman"/>
@@ -2096,6 +2247,8 @@
               <m:ctrlPr>
                 <w:rPr>
                   <w:rFonts w:ascii="Cambria Math" w:hAnsi="Cambria Math" w:cs="Times New Roman"/>
+                  <w:b/>
+                  <w:bCs/>
                 </w:rPr>
               </m:ctrlPr>
             </m:dPr>
@@ -2106,12 +2259,14 @@
                 </m:rPr>
                 <w:rPr>
                   <w:rFonts w:ascii="Times New Roman" w:hAnsi="Times New Roman" w:cs="Times New Roman"/>
+                  <w:b/>
+                  <w:bCs/>
                 </w:rPr>
                 <m:t>Visits</m:t>
               </m:r>
               <m:r>
                 <m:rPr>
-                  <m:sty m:val="p"/>
+                  <m:sty m:val="b"/>
                 </m:rPr>
                 <w:rPr>
                   <w:rFonts w:ascii="Cambria Math" w:hAnsi="Cambria Math" w:cs="Times New Roman"/>
@@ -2119,6 +2274,9 @@
                 <m:t>+</m:t>
               </m:r>
               <m:r>
+                <m:rPr>
+                  <m:sty m:val="bi"/>
+                </m:rPr>
                 <w:rPr>
                   <w:rFonts w:ascii="Cambria Math" w:hAnsi="Cambria Math" w:cs="Times New Roman"/>
                 </w:rPr>
@@ -2128,7 +2286,7 @@
           </m:d>
           <m:r>
             <m:rPr>
-              <m:sty m:val="p"/>
+              <m:sty m:val="b"/>
             </m:rPr>
             <w:rPr>
               <w:rFonts w:ascii="Cambria Math" w:hAnsi="Cambria Math" w:cs="Times New Roman"/>
@@ -2140,11 +2298,16 @@
               <m:ctrlPr>
                 <w:rPr>
                   <w:rFonts w:ascii="Cambria Math" w:hAnsi="Cambria Math" w:cs="Times New Roman"/>
+                  <w:b/>
+                  <w:bCs/>
                 </w:rPr>
               </m:ctrlPr>
             </m:sSubPr>
             <m:e>
               <m:r>
+                <m:rPr>
+                  <m:sty m:val="bi"/>
+                </m:rPr>
                 <w:rPr>
                   <w:rFonts w:ascii="Cambria Math" w:hAnsi="Cambria Math" w:cs="Times New Roman"/>
                 </w:rPr>
@@ -2153,6 +2316,9 @@
             </m:e>
             <m:sub>
               <m:r>
+                <m:rPr>
+                  <m:sty m:val="bi"/>
+                </m:rPr>
                 <w:rPr>
                   <w:rFonts w:ascii="Cambria Math" w:hAnsi="Cambria Math" w:cs="Times New Roman"/>
                 </w:rPr>
@@ -2162,7 +2328,7 @@
           </m:sSub>
           <m:r>
             <m:rPr>
-              <m:sty m:val="p"/>
+              <m:sty m:val="b"/>
             </m:rPr>
             <w:rPr>
               <w:rFonts w:ascii="Cambria Math" w:hAnsi="Cambria Math" w:cs="Times New Roman"/>
@@ -2174,11 +2340,16 @@
               <m:ctrlPr>
                 <w:rPr>
                   <w:rFonts w:ascii="Cambria Math" w:hAnsi="Cambria Math" w:cs="Times New Roman"/>
+                  <w:b/>
+                  <w:bCs/>
                 </w:rPr>
               </m:ctrlPr>
             </m:sSubPr>
             <m:e>
               <m:r>
+                <m:rPr>
+                  <m:sty m:val="bi"/>
+                </m:rPr>
                 <w:rPr>
                   <w:rFonts w:ascii="Cambria Math" w:hAnsi="Cambria Math" w:cs="Times New Roman"/>
                 </w:rPr>
@@ -2187,6 +2358,9 @@
             </m:e>
             <m:sub>
               <m:r>
+                <m:rPr>
+                  <m:sty m:val="bi"/>
+                </m:rPr>
                 <w:rPr>
                   <w:rFonts w:ascii="Cambria Math" w:hAnsi="Cambria Math" w:cs="Times New Roman"/>
                 </w:rPr>
@@ -2196,7 +2370,7 @@
           </m:sSub>
           <m:r>
             <m:rPr>
-              <m:sty m:val="p"/>
+              <m:sty m:val="b"/>
             </m:rPr>
             <w:rPr>
               <w:rFonts w:ascii="Cambria Math" w:hAnsi="Cambria Math" w:cs="Times New Roman"/>
@@ -2209,12 +2383,14 @@
             </m:rPr>
             <w:rPr>
               <w:rFonts w:ascii="Times New Roman" w:hAnsi="Times New Roman" w:cs="Times New Roman"/>
+              <w:b/>
+              <w:bCs/>
             </w:rPr>
             <m:t>Rainfall</m:t>
           </m:r>
           <m:r>
             <m:rPr>
-              <m:sty m:val="p"/>
+              <m:sty m:val="b"/>
             </m:rPr>
             <w:rPr>
               <w:rFonts w:ascii="Cambria Math" w:hAnsi="Cambria Math" w:cs="Times New Roman"/>
@@ -2226,11 +2402,16 @@
               <m:ctrlPr>
                 <w:rPr>
                   <w:rFonts w:ascii="Cambria Math" w:hAnsi="Cambria Math" w:cs="Times New Roman"/>
+                  <w:b/>
+                  <w:bCs/>
                 </w:rPr>
               </m:ctrlPr>
             </m:sSubPr>
             <m:e>
               <m:r>
+                <m:rPr>
+                  <m:sty m:val="bi"/>
+                </m:rPr>
                 <w:rPr>
                   <w:rFonts w:ascii="Cambria Math" w:hAnsi="Cambria Math" w:cs="Times New Roman"/>
                 </w:rPr>
@@ -2239,6 +2420,9 @@
             </m:e>
             <m:sub>
               <m:r>
+                <m:rPr>
+                  <m:sty m:val="bi"/>
+                </m:rPr>
                 <w:rPr>
                   <w:rFonts w:ascii="Cambria Math" w:hAnsi="Cambria Math" w:cs="Times New Roman"/>
                 </w:rPr>
@@ -2248,7 +2432,7 @@
           </m:sSub>
           <m:r>
             <m:rPr>
-              <m:sty m:val="p"/>
+              <m:sty m:val="b"/>
             </m:rPr>
             <w:rPr>
               <w:rFonts w:ascii="Cambria Math" w:hAnsi="Cambria Math" w:cs="Times New Roman"/>
@@ -2261,12 +2445,14 @@
             </m:rPr>
             <w:rPr>
               <w:rFonts w:ascii="Times New Roman" w:hAnsi="Times New Roman" w:cs="Times New Roman"/>
+              <w:b/>
+              <w:bCs/>
             </w:rPr>
             <m:t>Heat</m:t>
           </m:r>
           <m:r>
             <m:rPr>
-              <m:sty m:val="p"/>
+              <m:sty m:val="b"/>
             </m:rPr>
             <w:rPr>
               <w:rFonts w:ascii="Cambria Math" w:hAnsi="Cambria Math" w:cs="Times New Roman"/>
@@ -2278,11 +2464,16 @@
               <m:ctrlPr>
                 <w:rPr>
                   <w:rFonts w:ascii="Cambria Math" w:hAnsi="Cambria Math" w:cs="Times New Roman"/>
+                  <w:b/>
+                  <w:bCs/>
                 </w:rPr>
               </m:ctrlPr>
             </m:sSubPr>
             <m:e>
               <m:r>
+                <m:rPr>
+                  <m:sty m:val="bi"/>
+                </m:rPr>
                 <w:rPr>
                   <w:rFonts w:ascii="Cambria Math" w:hAnsi="Cambria Math" w:cs="Times New Roman"/>
                 </w:rPr>
@@ -2291,6 +2482,9 @@
             </m:e>
             <m:sub>
               <m:r>
+                <m:rPr>
+                  <m:sty m:val="bi"/>
+                </m:rPr>
                 <w:rPr>
                   <w:rFonts w:ascii="Cambria Math" w:hAnsi="Cambria Math" w:cs="Times New Roman"/>
                 </w:rPr>
@@ -2300,7 +2494,7 @@
           </m:sSub>
           <m:r>
             <m:rPr>
-              <m:sty m:val="p"/>
+              <m:sty m:val="b"/>
             </m:rPr>
             <w:rPr>
               <w:rFonts w:ascii="Cambria Math" w:hAnsi="Cambria Math" w:cs="Times New Roman"/>
@@ -2313,19 +2507,41 @@
             </m:rPr>
             <w:rPr>
               <w:rFonts w:ascii="Times New Roman" w:hAnsi="Times New Roman" w:cs="Times New Roman"/>
+              <w:b/>
+              <w:bCs/>
             </w:rPr>
             <m:t>NDVI</m:t>
           </m:r>
           <m:r>
             <m:rPr>
-              <m:sty m:val="p"/>
+              <m:sty m:val="b"/>
             </m:rPr>
             <w:rPr>
               <w:rFonts w:ascii="Cambria Math" w:hAnsi="Cambria Math" w:cs="Times New Roman"/>
             </w:rPr>
             <m:t>+</m:t>
           </m:r>
+        </m:oMath>
+      </m:oMathPara>
+    </w:p>
+    <w:p>
+      <w:pPr>
+        <w:pStyle w:val="BodyText"/>
+        <w:rPr>
+          <w:rFonts w:ascii="Times New Roman" w:hAnsi="Times New Roman" w:cs="Times New Roman"/>
+          <w:b/>
+          <w:bCs/>
+        </w:rPr>
+      </w:pPr>
+      <m:oMathPara>
+        <m:oMathParaPr>
+          <m:jc m:val="center"/>
+        </m:oMathParaPr>
+        <m:oMath>
           <m:r>
+            <m:rPr>
+              <m:sty m:val="bi"/>
+            </m:rPr>
             <w:rPr>
               <w:rFonts w:ascii="Cambria Math" w:hAnsi="Cambria Math" w:cs="Times New Roman"/>
             </w:rPr>
@@ -2336,6 +2552,8 @@
               <m:ctrlPr>
                 <w:rPr>
                   <w:rFonts w:ascii="Cambria Math" w:hAnsi="Cambria Math" w:cs="Times New Roman"/>
+                  <w:b/>
+                  <w:bCs/>
                 </w:rPr>
               </m:ctrlPr>
             </m:dPr>
@@ -2346,6 +2564,8 @@
                 </m:rPr>
                 <w:rPr>
                   <w:rFonts w:ascii="Times New Roman" w:hAnsi="Times New Roman" w:cs="Times New Roman"/>
+                  <w:b/>
+                  <w:bCs/>
                 </w:rPr>
                 <m:t>LGA</m:t>
               </m:r>
@@ -2353,7 +2573,7 @@
           </m:d>
           <m:r>
             <m:rPr>
-              <m:sty m:val="p"/>
+              <m:sty m:val="b"/>
             </m:rPr>
             <w:rPr>
               <w:rFonts w:ascii="Cambria Math" w:hAnsi="Cambria Math" w:cs="Times New Roman"/>
@@ -2361,6 +2581,9 @@
             <m:t>+</m:t>
           </m:r>
           <m:r>
+            <m:rPr>
+              <m:sty m:val="bi"/>
+            </m:rPr>
             <w:rPr>
               <w:rFonts w:ascii="Cambria Math" w:hAnsi="Cambria Math" w:cs="Times New Roman"/>
             </w:rPr>
@@ -2371,6 +2594,8 @@
               <m:ctrlPr>
                 <w:rPr>
                   <w:rFonts w:ascii="Cambria Math" w:hAnsi="Cambria Math" w:cs="Times New Roman"/>
+                  <w:b/>
+                  <w:bCs/>
                 </w:rPr>
               </m:ctrlPr>
             </m:dPr>
@@ -2381,6 +2606,8 @@
                 </m:rPr>
                 <w:rPr>
                   <w:rFonts w:ascii="Times New Roman" w:hAnsi="Times New Roman" w:cs="Times New Roman"/>
+                  <w:b/>
+                  <w:bCs/>
                 </w:rPr>
                 <m:t>day-of-week</m:t>
               </m:r>
@@ -2388,7 +2615,7 @@
           </m:d>
           <m:r>
             <m:rPr>
-              <m:sty m:val="p"/>
+              <m:sty m:val="b"/>
             </m:rPr>
             <w:rPr>
               <w:rFonts w:ascii="Cambria Math" w:hAnsi="Cambria Math" w:cs="Times New Roman"/>
@@ -2396,6 +2623,9 @@
             <m:t>+</m:t>
           </m:r>
           <m:r>
+            <m:rPr>
+              <m:sty m:val="bi"/>
+            </m:rPr>
             <w:rPr>
               <w:rFonts w:ascii="Cambria Math" w:hAnsi="Cambria Math" w:cs="Times New Roman"/>
             </w:rPr>
@@ -2406,6 +2636,8 @@
               <m:ctrlPr>
                 <w:rPr>
                   <w:rFonts w:ascii="Cambria Math" w:hAnsi="Cambria Math" w:cs="Times New Roman"/>
+                  <w:b/>
+                  <w:bCs/>
                 </w:rPr>
               </m:ctrlPr>
             </m:dPr>
@@ -2416,6 +2648,8 @@
                 </m:rPr>
                 <w:rPr>
                   <w:rFonts w:ascii="Times New Roman" w:hAnsi="Times New Roman" w:cs="Times New Roman"/>
+                  <w:b/>
+                  <w:bCs/>
                 </w:rPr>
                 <m:t>month-year</m:t>
               </m:r>
@@ -2423,7 +2657,7 @@
           </m:d>
           <m:r>
             <m:rPr>
-              <m:sty m:val="p"/>
+              <m:sty m:val="b"/>
             </m:rPr>
             <w:rPr>
               <w:rFonts w:ascii="Cambria Math" w:hAnsi="Cambria Math" w:cs="Times New Roman"/>
@@ -2431,6 +2665,9 @@
             <m:t>+</m:t>
           </m:r>
           <m:r>
+            <m:rPr>
+              <m:sty m:val="bi"/>
+            </m:rPr>
             <w:rPr>
               <w:rFonts w:ascii="Cambria Math" w:hAnsi="Cambria Math" w:cs="Times New Roman"/>
             </w:rPr>
@@ -2452,12 +2689,21 @@
         </w:rPr>
         <w:t xml:space="preserve">estimated through </w:t>
       </w:r>
+      <w:proofErr w:type="gramStart"/>
       <w:r>
         <w:rPr>
           <w:rStyle w:val="VerbatimChar"/>
           <w:rFonts w:ascii="Times New Roman" w:hAnsi="Times New Roman" w:cs="Times New Roman"/>
         </w:rPr>
-        <w:t>feols()</w:t>
+        <w:t>feols(</w:t>
+      </w:r>
+      <w:proofErr w:type="gramEnd"/>
+      <w:r>
+        <w:rPr>
+          <w:rStyle w:val="VerbatimChar"/>
+          <w:rFonts w:ascii="Times New Roman" w:hAnsi="Times New Roman" w:cs="Times New Roman"/>
+        </w:rPr>
+        <w:t>)</w:t>
       </w:r>
       <w:r>
         <w:rPr>
@@ -2562,28 +2808,22 @@
         <w:rPr>
           <w:rFonts w:ascii="Times New Roman" w:hAnsi="Times New Roman" w:cs="Times New Roman"/>
         </w:rPr>
-        <w:t xml:space="preserve">A negative binomial model was tested as an alternative, since visit data shaped by discrete events such as market days and religious holiday periods typically shows variance well above </w:t>
-      </w:r>
-      <w:r>
-        <w:rPr>
-          <w:rFonts w:ascii="Times New Roman" w:hAnsi="Times New Roman" w:cs="Times New Roman"/>
+        <w:t>A negative binomial model was tested as an alternative, since visit data shaped by discrete events such as market days and religious holiday periods typically shows variance well above the mean, a pattern the variance-to-mean ratio confirms here and one that Poisson’s equal-variance assumption cannot accommodate.</w:t>
+      </w:r>
+    </w:p>
+    <w:p>
+      <w:pPr>
+        <w:pStyle w:val="CaptionedFigure"/>
+        <w:rPr>
+          <w:rFonts w:ascii="Times New Roman" w:hAnsi="Times New Roman" w:cs="Times New Roman"/>
+        </w:rPr>
+      </w:pPr>
+      <w:r>
+        <w:rPr>
+          <w:rFonts w:ascii="Times New Roman" w:hAnsi="Times New Roman" w:cs="Times New Roman"/>
+          <w:noProof/>
         </w:rPr>
         <w:lastRenderedPageBreak/>
-        <w:t>the mean, a pattern the variance-to-mean ratio confirms here and one that Poisson’s equal-variance assumption cannot accommodate.</w:t>
-      </w:r>
-    </w:p>
-    <w:p>
-      <w:pPr>
-        <w:pStyle w:val="CaptionedFigure"/>
-        <w:rPr>
-          <w:rFonts w:ascii="Times New Roman" w:hAnsi="Times New Roman" w:cs="Times New Roman"/>
-        </w:rPr>
-      </w:pPr>
-      <w:r>
-        <w:rPr>
-          <w:rFonts w:ascii="Times New Roman" w:hAnsi="Times New Roman" w:cs="Times New Roman"/>
-          <w:noProof/>
-        </w:rPr>
         <w:drawing>
           <wp:inline distT="0" distB="0" distL="0" distR="0" wp14:anchorId="771C1882" wp14:editId="0BE52772">
             <wp:extent cx="5753100" cy="2761487"/>
@@ -2836,7 +3076,15 @@
         <w:rPr>
           <w:rFonts w:ascii="Times New Roman" w:hAnsi="Times New Roman" w:cs="Times New Roman"/>
         </w:rPr>
-        <w:t xml:space="preserve"> Once included, it will let a reader see whether the exclusion steps above fall unevenly across the two states, a question the pooled waterfall alone cannot answer.</w:t>
+        <w:t xml:space="preserve"> </w:t>
+      </w:r>
+      <w:r>
+        <w:rPr>
+          <w:rFonts w:ascii="Times New Roman" w:hAnsi="Times New Roman" w:cs="Times New Roman"/>
+          <w:i/>
+          <w:iCs/>
+        </w:rPr>
+        <w:t>Once included, it will let a reader see whether the exclusion steps above fall unevenly across the two states, a question the pooled waterfall alone cannot answer.</w:t>
       </w:r>
     </w:p>
     <w:p>
@@ -3091,14 +3339,35 @@
         <w:pStyle w:val="FirstParagraph"/>
         <w:rPr>
           <w:rFonts w:ascii="Times New Roman" w:hAnsi="Times New Roman" w:cs="Times New Roman"/>
-        </w:rPr>
-      </w:pPr>
-      <w:r>
-        <w:rPr>
-          <w:rFonts w:ascii="Times New Roman" w:hAnsi="Times New Roman" w:cs="Times New Roman"/>
           <w:b/>
           <w:bCs/>
         </w:rPr>
+      </w:pPr>
+    </w:p>
+    <w:p>
+      <w:pPr>
+        <w:pStyle w:val="FirstParagraph"/>
+        <w:rPr>
+          <w:rFonts w:ascii="Times New Roman" w:hAnsi="Times New Roman" w:cs="Times New Roman"/>
+          <w:b/>
+          <w:bCs/>
+        </w:rPr>
+      </w:pPr>
+    </w:p>
+    <w:p>
+      <w:pPr>
+        <w:pStyle w:val="FirstParagraph"/>
+        <w:rPr>
+          <w:rFonts w:ascii="Times New Roman" w:hAnsi="Times New Roman" w:cs="Times New Roman"/>
+        </w:rPr>
+      </w:pPr>
+      <w:r>
+        <w:rPr>
+          <w:rFonts w:ascii="Times New Roman" w:hAnsi="Times New Roman" w:cs="Times New Roman"/>
+          <w:b/>
+          <w:bCs/>
+        </w:rPr>
+        <w:lastRenderedPageBreak/>
         <w:t>Table 3.1a. Zero-dose model — regression summary</w:t>
       </w:r>
     </w:p>
@@ -3191,7 +3460,6 @@
               <w:rPr>
                 <w:rFonts w:ascii="Times New Roman" w:hAnsi="Times New Roman" w:cs="Times New Roman"/>
               </w:rPr>
-              <w:lastRenderedPageBreak/>
               <w:t>Distance to health facility (km)</w:t>
             </w:r>
           </w:p>
@@ -4337,7 +4605,21 @@
         <w:rPr>
           <w:rFonts w:ascii="Times New Roman" w:hAnsi="Times New Roman" w:cs="Times New Roman"/>
         </w:rPr>
-        <w:t>The full tracing dataset comprises 38,913 attempts. A lag-time value, days since the child’s last recorded visit, can only be constructed for attempts where a prior visit exists in the facility visits table, which holds for 16,132 of these, fewer than half. This is a substantial loss of observations, and the two subsets are unlikely to be equivalent. Children retained in the lag-time subset have, by construction, at least one prior recorded visit, meaning they were already somewhat engaged with the formal system before defaulting, a different and probably more reachable population than the full traced group, which also includes children with no prior visit history at all.</w:t>
+        <w:t xml:space="preserve">The full tracing dataset comprises 38,913 attempts. A lag-time value, days since the child’s last recorded visit, can only be constructed for attempts where a prior visit exists in the facility visits table, which holds for 16,132 of these, fewer than half. This is a substantial loss of observations, and the two subsets are unlikely to be equivalent. Children retained in the lag-time subset have, by construction, at least one prior recorded visit, meaning they were already somewhat engaged with the formal system before defaulting, a different and probably more reachable population than the </w:t>
+      </w:r>
+      <w:proofErr w:type="gramStart"/>
+      <w:r>
+        <w:rPr>
+          <w:rFonts w:ascii="Times New Roman" w:hAnsi="Times New Roman" w:cs="Times New Roman"/>
+        </w:rPr>
+        <w:t>full traced</w:t>
+      </w:r>
+      <w:proofErr w:type="gramEnd"/>
+      <w:r>
+        <w:rPr>
+          <w:rFonts w:ascii="Times New Roman" w:hAnsi="Times New Roman" w:cs="Times New Roman"/>
+        </w:rPr>
+        <w:t xml:space="preserve"> group, which also includes children with no prior visit history at all.</w:t>
       </w:r>
     </w:p>
     <w:p>
@@ -4647,14 +4929,45 @@
         <w:pStyle w:val="BodyText"/>
         <w:rPr>
           <w:rFonts w:ascii="Times New Roman" w:hAnsi="Times New Roman" w:cs="Times New Roman"/>
-        </w:rPr>
-      </w:pPr>
-      <w:r>
-        <w:rPr>
-          <w:rFonts w:ascii="Times New Roman" w:hAnsi="Times New Roman" w:cs="Times New Roman"/>
           <w:b/>
           <w:bCs/>
         </w:rPr>
+      </w:pPr>
+    </w:p>
+    <w:p>
+      <w:pPr>
+        <w:pStyle w:val="BodyText"/>
+        <w:rPr>
+          <w:rFonts w:ascii="Times New Roman" w:hAnsi="Times New Roman" w:cs="Times New Roman"/>
+          <w:b/>
+          <w:bCs/>
+        </w:rPr>
+      </w:pPr>
+    </w:p>
+    <w:p>
+      <w:pPr>
+        <w:pStyle w:val="BodyText"/>
+        <w:rPr>
+          <w:rFonts w:ascii="Times New Roman" w:hAnsi="Times New Roman" w:cs="Times New Roman"/>
+          <w:b/>
+          <w:bCs/>
+        </w:rPr>
+      </w:pPr>
+    </w:p>
+    <w:p>
+      <w:pPr>
+        <w:pStyle w:val="BodyText"/>
+        <w:rPr>
+          <w:rFonts w:ascii="Times New Roman" w:hAnsi="Times New Roman" w:cs="Times New Roman"/>
+        </w:rPr>
+      </w:pPr>
+      <w:r>
+        <w:rPr>
+          <w:rFonts w:ascii="Times New Roman" w:hAnsi="Times New Roman" w:cs="Times New Roman"/>
+          <w:b/>
+          <w:bCs/>
+        </w:rPr>
+        <w:lastRenderedPageBreak/>
         <w:t>Table 3.2. Weather model — main results</w:t>
       </w:r>
     </w:p>
@@ -4850,7 +5163,6 @@
               <w:rPr>
                 <w:rFonts w:ascii="Times New Roman" w:hAnsi="Times New Roman" w:cs="Times New Roman"/>
               </w:rPr>
-              <w:lastRenderedPageBreak/>
               <w:t>W1</w:t>
             </w:r>
           </w:p>
@@ -5810,14 +6122,45 @@
         <w:pStyle w:val="BodyText"/>
         <w:rPr>
           <w:rFonts w:ascii="Times New Roman" w:hAnsi="Times New Roman" w:cs="Times New Roman"/>
-        </w:rPr>
-      </w:pPr>
-      <w:r>
-        <w:rPr>
-          <w:rFonts w:ascii="Times New Roman" w:hAnsi="Times New Roman" w:cs="Times New Roman"/>
           <w:b/>
           <w:bCs/>
         </w:rPr>
+      </w:pPr>
+    </w:p>
+    <w:p>
+      <w:pPr>
+        <w:pStyle w:val="BodyText"/>
+        <w:rPr>
+          <w:rFonts w:ascii="Times New Roman" w:hAnsi="Times New Roman" w:cs="Times New Roman"/>
+          <w:b/>
+          <w:bCs/>
+        </w:rPr>
+      </w:pPr>
+    </w:p>
+    <w:p>
+      <w:pPr>
+        <w:pStyle w:val="BodyText"/>
+        <w:rPr>
+          <w:rFonts w:ascii="Times New Roman" w:hAnsi="Times New Roman" w:cs="Times New Roman"/>
+          <w:b/>
+          <w:bCs/>
+        </w:rPr>
+      </w:pPr>
+    </w:p>
+    <w:p>
+      <w:pPr>
+        <w:pStyle w:val="BodyText"/>
+        <w:rPr>
+          <w:rFonts w:ascii="Times New Roman" w:hAnsi="Times New Roman" w:cs="Times New Roman"/>
+        </w:rPr>
+      </w:pPr>
+      <w:r>
+        <w:rPr>
+          <w:rFonts w:ascii="Times New Roman" w:hAnsi="Times New Roman" w:cs="Times New Roman"/>
+          <w:b/>
+          <w:bCs/>
+        </w:rPr>
+        <w:lastRenderedPageBreak/>
         <w:t>Table 3.3. Weather model — offset and spline robustness</w:t>
       </w:r>
     </w:p>
@@ -5974,149 +6317,102 @@
               <w:rPr>
                 <w:rFonts w:ascii="Times New Roman" w:hAnsi="Times New Roman" w:cs="Times New Roman"/>
               </w:rPr>
-              <w:t>Precipitatio</w:t>
-            </w:r>
-            <w:r>
-              <w:rPr>
-                <w:rFonts w:ascii="Times New Roman" w:hAnsi="Times New Roman" w:cs="Times New Roman"/>
-              </w:rPr>
-              <w:lastRenderedPageBreak/>
-              <w:t>n (daily, P4)</w:t>
-            </w:r>
-          </w:p>
-        </w:tc>
-        <w:tc>
-          <w:tcPr>
-            <w:tcW w:w="0" w:type="auto"/>
-          </w:tcPr>
-          <w:p>
-            <w:pPr>
-              <w:pStyle w:val="Compact"/>
-              <w:rPr>
-                <w:rFonts w:ascii="Times New Roman" w:hAnsi="Times New Roman" w:cs="Times New Roman"/>
-              </w:rPr>
-            </w:pPr>
-            <w:r>
-              <w:rPr>
-                <w:rFonts w:ascii="Times New Roman" w:hAnsi="Times New Roman" w:cs="Times New Roman"/>
-              </w:rPr>
-              <w:lastRenderedPageBreak/>
-              <w:t>precip_anomaly_</w:t>
-            </w:r>
-            <w:r>
-              <w:rPr>
-                <w:rFonts w:ascii="Times New Roman" w:hAnsi="Times New Roman" w:cs="Times New Roman"/>
-              </w:rPr>
-              <w:lastRenderedPageBreak/>
-              <w:t>pct</w:t>
-            </w:r>
-          </w:p>
-        </w:tc>
-        <w:tc>
-          <w:tcPr>
-            <w:tcW w:w="0" w:type="auto"/>
-          </w:tcPr>
-          <w:p>
-            <w:pPr>
-              <w:pStyle w:val="Compact"/>
-              <w:rPr>
-                <w:rFonts w:ascii="Times New Roman" w:hAnsi="Times New Roman" w:cs="Times New Roman"/>
-              </w:rPr>
-            </w:pPr>
-            <w:r>
-              <w:rPr>
-                <w:rFonts w:ascii="Times New Roman" w:hAnsi="Times New Roman" w:cs="Times New Roman"/>
-              </w:rPr>
-              <w:lastRenderedPageBreak/>
-              <w:t>0.001 [-</w:t>
-            </w:r>
-            <w:r>
-              <w:rPr>
-                <w:rFonts w:ascii="Times New Roman" w:hAnsi="Times New Roman" w:cs="Times New Roman"/>
-              </w:rPr>
-              <w:lastRenderedPageBreak/>
-              <w:t>0.003, 0.005]</w:t>
-            </w:r>
-          </w:p>
-        </w:tc>
-        <w:tc>
-          <w:tcPr>
-            <w:tcW w:w="0" w:type="auto"/>
-          </w:tcPr>
-          <w:p>
-            <w:pPr>
-              <w:pStyle w:val="Compact"/>
-              <w:rPr>
-                <w:rFonts w:ascii="Times New Roman" w:hAnsi="Times New Roman" w:cs="Times New Roman"/>
-              </w:rPr>
-            </w:pPr>
-            <w:r>
-              <w:rPr>
-                <w:rFonts w:ascii="Times New Roman" w:hAnsi="Times New Roman" w:cs="Times New Roman"/>
-              </w:rPr>
-              <w:lastRenderedPageBreak/>
-              <w:t>0.000 [-</w:t>
-            </w:r>
-            <w:r>
-              <w:rPr>
-                <w:rFonts w:ascii="Times New Roman" w:hAnsi="Times New Roman" w:cs="Times New Roman"/>
-              </w:rPr>
-              <w:lastRenderedPageBreak/>
-              <w:t>0.004, 0.004]</w:t>
-            </w:r>
-          </w:p>
-        </w:tc>
-        <w:tc>
-          <w:tcPr>
-            <w:tcW w:w="0" w:type="auto"/>
-          </w:tcPr>
-          <w:p>
-            <w:pPr>
-              <w:pStyle w:val="Compact"/>
-              <w:rPr>
-                <w:rFonts w:ascii="Times New Roman" w:hAnsi="Times New Roman" w:cs="Times New Roman"/>
-              </w:rPr>
-            </w:pPr>
-            <w:r>
-              <w:rPr>
-                <w:rFonts w:ascii="Times New Roman" w:hAnsi="Times New Roman" w:cs="Times New Roman"/>
-              </w:rPr>
-              <w:lastRenderedPageBreak/>
-              <w:t>-0.000 [-</w:t>
-            </w:r>
-            <w:r>
-              <w:rPr>
-                <w:rFonts w:ascii="Times New Roman" w:hAnsi="Times New Roman" w:cs="Times New Roman"/>
-              </w:rPr>
-              <w:lastRenderedPageBreak/>
-              <w:t>0.004, 0.004]</w:t>
-            </w:r>
-          </w:p>
-        </w:tc>
-        <w:tc>
-          <w:tcPr>
-            <w:tcW w:w="0" w:type="auto"/>
-          </w:tcPr>
-          <w:p>
-            <w:pPr>
-              <w:pStyle w:val="Compact"/>
-              <w:rPr>
-                <w:rFonts w:ascii="Times New Roman" w:hAnsi="Times New Roman" w:cs="Times New Roman"/>
-              </w:rPr>
-            </w:pPr>
-            <w:r>
-              <w:rPr>
-                <w:rFonts w:ascii="Times New Roman" w:hAnsi="Times New Roman" w:cs="Times New Roman"/>
-              </w:rPr>
-              <w:lastRenderedPageBreak/>
-              <w:t xml:space="preserve">Yes — at </w:t>
-            </w:r>
-            <w:r>
-              <w:rPr>
-                <w:rFonts w:ascii="Times New Roman" w:hAnsi="Times New Roman" w:cs="Times New Roman"/>
-              </w:rPr>
-              <w:lastRenderedPageBreak/>
-              <w:t>least one spline term p&lt;0.05</w:t>
+              <w:t>Precipitation (daily, P4)</w:t>
+            </w:r>
+          </w:p>
+        </w:tc>
+        <w:tc>
+          <w:tcPr>
+            <w:tcW w:w="0" w:type="auto"/>
+          </w:tcPr>
+          <w:p>
+            <w:pPr>
+              <w:pStyle w:val="Compact"/>
+              <w:rPr>
+                <w:rFonts w:ascii="Times New Roman" w:hAnsi="Times New Roman" w:cs="Times New Roman"/>
+              </w:rPr>
+            </w:pPr>
+            <w:r>
+              <w:rPr>
+                <w:rFonts w:ascii="Times New Roman" w:hAnsi="Times New Roman" w:cs="Times New Roman"/>
+              </w:rPr>
+              <w:t>precip_anomaly_pct</w:t>
+            </w:r>
+          </w:p>
+        </w:tc>
+        <w:tc>
+          <w:tcPr>
+            <w:tcW w:w="0" w:type="auto"/>
+          </w:tcPr>
+          <w:p>
+            <w:pPr>
+              <w:pStyle w:val="Compact"/>
+              <w:rPr>
+                <w:rFonts w:ascii="Times New Roman" w:hAnsi="Times New Roman" w:cs="Times New Roman"/>
+              </w:rPr>
+            </w:pPr>
+            <w:r>
+              <w:rPr>
+                <w:rFonts w:ascii="Times New Roman" w:hAnsi="Times New Roman" w:cs="Times New Roman"/>
+              </w:rPr>
+              <w:t>0.001 [-0.003, 0.005]</w:t>
+            </w:r>
+          </w:p>
+        </w:tc>
+        <w:tc>
+          <w:tcPr>
+            <w:tcW w:w="0" w:type="auto"/>
+          </w:tcPr>
+          <w:p>
+            <w:pPr>
+              <w:pStyle w:val="Compact"/>
+              <w:rPr>
+                <w:rFonts w:ascii="Times New Roman" w:hAnsi="Times New Roman" w:cs="Times New Roman"/>
+              </w:rPr>
+            </w:pPr>
+            <w:r>
+              <w:rPr>
+                <w:rFonts w:ascii="Times New Roman" w:hAnsi="Times New Roman" w:cs="Times New Roman"/>
+              </w:rPr>
+              <w:t>0.000 [-0.004, 0.004]</w:t>
+            </w:r>
+          </w:p>
+        </w:tc>
+        <w:tc>
+          <w:tcPr>
+            <w:tcW w:w="0" w:type="auto"/>
+          </w:tcPr>
+          <w:p>
+            <w:pPr>
+              <w:pStyle w:val="Compact"/>
+              <w:rPr>
+                <w:rFonts w:ascii="Times New Roman" w:hAnsi="Times New Roman" w:cs="Times New Roman"/>
+              </w:rPr>
+            </w:pPr>
+            <w:r>
+              <w:rPr>
+                <w:rFonts w:ascii="Times New Roman" w:hAnsi="Times New Roman" w:cs="Times New Roman"/>
+              </w:rPr>
+              <w:t>-0.000 [-0.004, 0.004]</w:t>
+            </w:r>
+          </w:p>
+        </w:tc>
+        <w:tc>
+          <w:tcPr>
+            <w:tcW w:w="0" w:type="auto"/>
+          </w:tcPr>
+          <w:p>
+            <w:pPr>
+              <w:pStyle w:val="Compact"/>
+              <w:rPr>
+                <w:rFonts w:ascii="Times New Roman" w:hAnsi="Times New Roman" w:cs="Times New Roman"/>
+              </w:rPr>
+            </w:pPr>
+            <w:r>
+              <w:rPr>
+                <w:rFonts w:ascii="Times New Roman" w:hAnsi="Times New Roman" w:cs="Times New Roman"/>
+              </w:rPr>
+              <w:t>Yes — at least one spline term p&lt;0.05</w:t>
             </w:r>
           </w:p>
         </w:tc>
@@ -6137,7 +6433,6 @@
               <w:rPr>
                 <w:rFonts w:ascii="Times New Roman" w:hAnsi="Times New Roman" w:cs="Times New Roman"/>
               </w:rPr>
-              <w:lastRenderedPageBreak/>
               <w:t>Heat, binary (D3)</w:t>
             </w:r>
           </w:p>
@@ -6619,6 +6914,7 @@
           <w:rFonts w:ascii="Times New Roman" w:hAnsi="Times New Roman" w:cs="Times New Roman"/>
           <w:noProof/>
         </w:rPr>
+        <w:lastRenderedPageBreak/>
         <w:drawing>
           <wp:inline distT="0" distB="0" distL="0" distR="0" wp14:anchorId="66599446" wp14:editId="159A2563">
             <wp:extent cx="5753100" cy="2991612"/>
@@ -6687,7 +6983,6 @@
         <w:rPr>
           <w:rFonts w:ascii="Times New Roman" w:hAnsi="Times New Roman" w:cs="Times New Roman"/>
         </w:rPr>
-        <w:lastRenderedPageBreak/>
         <w:t>Same coefficients as Table 3.3, plotted with CIs across the three specifications side by side. Facility- and LGA-level heterogeneity checks (not shown as a separate numbered table) found isolated significant effects at only one or two individual sites out of roughly twenty tested, consistent with noise rather than a systematic effect.</w:t>
       </w:r>
     </w:p>
@@ -7581,19 +7876,6 @@
       <w:pPr>
         <w:pStyle w:val="BlockText"/>
         <w:rPr>
-          <w:rFonts w:ascii="Times New Roman" w:hAnsi="Times New Roman" w:cs="Times New Roman"/>
-        </w:rPr>
-      </w:pPr>
-      <w:r>
-        <w:rPr>
-          <w:rFonts w:ascii="Times New Roman" w:hAnsi="Times New Roman" w:cs="Times New Roman"/>
-        </w:rPr>
-        <w:t>Log-OLS and negative binomial coefficients side by side for all three weather variables. Both specifications agree on direction and non-significance throughout; the precipitation variable is the closest either comes to a conventional threshold, and even there both specifications remain nominally within the nulled interpretation given in Section III.C.ii.</w:t>
-      </w:r>
-    </w:p>
-    <w:p>
-      <w:pPr>
-        <w:rPr>
           <w:rFonts w:ascii="Times New Roman" w:eastAsiaTheme="majorEastAsia" w:hAnsi="Times New Roman" w:cs="Times New Roman"/>
           <w:b/>
           <w:bCs/>
@@ -7602,6 +7884,26 @@
           <w:szCs w:val="32"/>
         </w:rPr>
       </w:pPr>
+      <w:r>
+        <w:rPr>
+          <w:rFonts w:ascii="Times New Roman" w:hAnsi="Times New Roman" w:cs="Times New Roman"/>
+        </w:rPr>
+        <w:t xml:space="preserve">Log-OLS and negative binomial coefficients side by side for all three weather variables. Both specifications agree on direction and non-significance throughout; the precipitation variable is the closest either comes to a conventional threshold, and even there both specifications remain nominally within the nulled interpretation given in Section </w:t>
+      </w:r>
+      <w:proofErr w:type="spellStart"/>
+      <w:r>
+        <w:rPr>
+          <w:rFonts w:ascii="Times New Roman" w:hAnsi="Times New Roman" w:cs="Times New Roman"/>
+        </w:rPr>
+        <w:t>III.C.ii</w:t>
+      </w:r>
+      <w:proofErr w:type="spellEnd"/>
+      <w:r>
+        <w:rPr>
+          <w:rFonts w:ascii="Times New Roman" w:hAnsi="Times New Roman" w:cs="Times New Roman"/>
+        </w:rPr>
+        <w:t>.</w:t>
+      </w:r>
       <w:bookmarkStart w:id="26" w:name="iv.-discussion-and-synthesis"/>
       <w:bookmarkEnd w:id="14"/>
       <w:bookmarkEnd w:id="22"/>
@@ -8575,7 +8877,6 @@
         <w:rPr>
           <w:rFonts w:ascii="Times New Roman" w:hAnsi="Times New Roman" w:cs="Times New Roman"/>
         </w:rPr>
-        <w:lastRenderedPageBreak/>
         <w:t>Side-by-side comparison of outcome measured, weather exposure used, direction and significance of effect, and data-quality caveats across this thesis, Siddiqi et al. (2025) and Samano et al. (2021). Included mainly to make explicit that this thesis’s null sits against two comparators that both found significant effects.</w:t>
       </w:r>
     </w:p>

</xml_diff>